<commit_message>
chore: configurar deploy Vercel e dominio diegosantos.me
</commit_message>
<xml_diff>
--- a/recolocacao_diego/DIEGO_SANTOS.docx
+++ b/recolocacao_diego/DIEGO_SANTOS.docx
@@ -1279,6 +1279,11 @@
         </w:rPr>
         <w:t xml:space="preserve"> (Pandas, NumPy, Matplotlib, Scikit-learn) — Nível Intermediário/Avançado</w:t>
       </w:r>
+      <w:r>
+        <w:rPr>
+          <w:rtl w:val="0"/>
+        </w:rPr>
+      </w:r>
     </w:p>
     <w:p>
       <w:pPr>
@@ -1341,6 +1346,11 @@
         </w:rPr>
         <w:t xml:space="preserve"> (Consultas avançadas, Joins, Aggregations, CTEs) — Nível Intermediário</w:t>
       </w:r>
+      <w:r>
+        <w:rPr>
+          <w:rtl w:val="0"/>
+        </w:rPr>
+      </w:r>
     </w:p>
     <w:p>
       <w:pPr>
@@ -1403,6 +1413,11 @@
         </w:rPr>
         <w:t xml:space="preserve"> — Controle de versão, CI/CD básico</w:t>
       </w:r>
+      <w:r>
+        <w:rPr>
+          <w:rtl w:val="0"/>
+        </w:rPr>
+      </w:r>
     </w:p>
     <w:p>
       <w:pPr>
@@ -1538,6 +1553,11 @@
         </w:rPr>
         <w:t xml:space="preserve">ETL/ELT Design &amp; Implementation</w:t>
       </w:r>
+      <w:r>
+        <w:rPr>
+          <w:rtl w:val="0"/>
+        </w:rPr>
+      </w:r>
     </w:p>
     <w:p>
       <w:pPr>
@@ -1581,6 +1601,11 @@
         </w:rPr>
         <w:t xml:space="preserve">Pipeline Orchestration (n8n, Zapier, Make)</w:t>
       </w:r>
+      <w:r>
+        <w:rPr>
+          <w:rtl w:val="0"/>
+        </w:rPr>
+      </w:r>
     </w:p>
     <w:p>
       <w:pPr>
@@ -1624,6 +1649,11 @@
         </w:rPr>
         <w:t xml:space="preserve">Data Modeling &amp; Normalization</w:t>
       </w:r>
+      <w:r>
+        <w:rPr>
+          <w:rtl w:val="0"/>
+        </w:rPr>
+      </w:r>
     </w:p>
     <w:p>
       <w:pPr>
@@ -1667,6 +1697,11 @@
         </w:rPr>
         <w:t xml:space="preserve">Relational Databases (PostgreSQL, MySQL)</w:t>
       </w:r>
+      <w:r>
+        <w:rPr>
+          <w:rtl w:val="0"/>
+        </w:rPr>
+      </w:r>
     </w:p>
     <w:p>
       <w:pPr>
@@ -1710,6 +1745,11 @@
         </w:rPr>
         <w:t xml:space="preserve">Data Quality &amp; Validation</w:t>
       </w:r>
+      <w:r>
+        <w:rPr>
+          <w:rtl w:val="0"/>
+        </w:rPr>
+      </w:r>
     </w:p>
     <w:p>
       <w:pPr>
@@ -1753,6 +1793,11 @@
         </w:rPr>
         <w:t xml:space="preserve">Automation &amp; Process Optimization</w:t>
       </w:r>
+      <w:r>
+        <w:rPr>
+          <w:rtl w:val="0"/>
+        </w:rPr>
+      </w:r>
     </w:p>
     <w:p>
       <w:pPr>
@@ -1907,6 +1952,11 @@
         </w:rPr>
         <w:t xml:space="preserve"> n8n, Zapier, Make</w:t>
       </w:r>
+      <w:r>
+        <w:rPr>
+          <w:rtl w:val="0"/>
+        </w:rPr>
+      </w:r>
     </w:p>
     <w:p>
       <w:pPr>
@@ -1969,6 +2019,11 @@
         </w:rPr>
         <w:t xml:space="preserve"> PostgreSQL, MySQL, Google Sheets</w:t>
       </w:r>
+      <w:r>
+        <w:rPr>
+          <w:rtl w:val="0"/>
+        </w:rPr>
+      </w:r>
     </w:p>
     <w:p>
       <w:pPr>
@@ -2031,6 +2086,11 @@
         </w:rPr>
         <w:t xml:space="preserve"> Jupyter Notebooks, Git, GitHub</w:t>
       </w:r>
+      <w:r>
+        <w:rPr>
+          <w:rtl w:val="0"/>
+        </w:rPr>
+      </w:r>
     </w:p>
     <w:p>
       <w:pPr>
@@ -2093,6 +2153,11 @@
         </w:rPr>
         <w:t xml:space="preserve"> OpenAI API, Prompt Engineering</w:t>
       </w:r>
+      <w:r>
+        <w:rPr>
+          <w:rtl w:val="0"/>
+        </w:rPr>
+      </w:r>
     </w:p>
     <w:p>
       <w:pPr>
@@ -2155,6 +2220,11 @@
         </w:rPr>
         <w:t xml:space="preserve"> WhatsApp API, Notion API, REST APIs</w:t>
       </w:r>
+      <w:r>
+        <w:rPr>
+          <w:rtl w:val="0"/>
+        </w:rPr>
+      </w:r>
     </w:p>
     <w:p>
       <w:pPr>
@@ -2217,6 +2287,11 @@
         </w:rPr>
         <w:t xml:space="preserve"> Streamlit (prototipagem)</w:t>
       </w:r>
+      <w:r>
+        <w:rPr>
+          <w:rtl w:val="0"/>
+        </w:rPr>
+      </w:r>
     </w:p>
     <w:p>
       <w:pPr>
@@ -2352,6 +2427,11 @@
         </w:rPr>
         <w:t xml:space="preserve">Agile/Scrum</w:t>
       </w:r>
+      <w:r>
+        <w:rPr>
+          <w:rtl w:val="0"/>
+        </w:rPr>
+      </w:r>
     </w:p>
     <w:p>
       <w:pPr>
@@ -2395,6 +2475,11 @@
         </w:rPr>
         <w:t xml:space="preserve">Design Thinking &amp; Design Sprint</w:t>
       </w:r>
+      <w:r>
+        <w:rPr>
+          <w:rtl w:val="0"/>
+        </w:rPr>
+      </w:r>
     </w:p>
     <w:p>
       <w:pPr>
@@ -2438,6 +2523,11 @@
         </w:rPr>
         <w:t xml:space="preserve">Data-Driven Decision Making</w:t>
       </w:r>
+      <w:r>
+        <w:rPr>
+          <w:rtl w:val="0"/>
+        </w:rPr>
+      </w:r>
     </w:p>
     <w:p>
       <w:pPr>
@@ -2481,6 +2571,11 @@
         </w:rPr>
         <w:t xml:space="preserve">Requirements Analysis &amp; Stakeholder Management</w:t>
       </w:r>
+      <w:r>
+        <w:rPr>
+          <w:rtl w:val="0"/>
+        </w:rPr>
+      </w:r>
     </w:p>
     <w:p>
       <w:pPr>
@@ -2635,6 +2730,11 @@
         </w:rPr>
         <w:t xml:space="preserve"> Avançado (C1 — Proficiência Profissional Completa)</w:t>
       </w:r>
+      <w:r>
+        <w:rPr>
+          <w:rtl w:val="0"/>
+        </w:rPr>
+      </w:r>
     </w:p>
     <w:p>
       <w:pPr>
@@ -2697,6 +2797,11 @@
         </w:rPr>
         <w:t xml:space="preserve"> Nativo</w:t>
       </w:r>
+      <w:r>
+        <w:rPr>
+          <w:rtl w:val="0"/>
+        </w:rPr>
+      </w:r>
     </w:p>
     <w:p>
       <w:pPr>
@@ -3074,6 +3179,11 @@
         </w:rPr>
         <w:t xml:space="preserve">Estruturei processos de coleta de feedback quantitativo e qualitativo (User Research), gerando insights que impactaram decisões de marketing e estratégia de produto</w:t>
       </w:r>
+      <w:r>
+        <w:rPr>
+          <w:rtl w:val="0"/>
+        </w:rPr>
+      </w:r>
     </w:p>
     <w:p>
       <w:pPr>
@@ -3117,6 +3227,11 @@
         </w:rPr>
         <w:t xml:space="preserve">Analisei dados territoriais e KPIs para otimizar alocação de recursos, reduzindo desperdício operacional em ~15%</w:t>
       </w:r>
+      <w:r>
+        <w:rPr>
+          <w:rtl w:val="0"/>
+        </w:rPr>
+      </w:r>
     </w:p>
     <w:p>
       <w:pPr>
@@ -3160,6 +3275,11 @@
         </w:rPr>
         <w:t xml:space="preserve">Implementei monitoramento de dashboards de performance, permitindo decisões baseadas em dados em tempo real</w:t>
       </w:r>
+      <w:r>
+        <w:rPr>
+          <w:rtl w:val="0"/>
+        </w:rPr>
+      </w:r>
     </w:p>
     <w:p>
       <w:pPr>
@@ -3203,6 +3323,11 @@
         </w:rPr>
         <w:t xml:space="preserve">Traduzi necessidades de campo em requisitos técnicos para equipes de produto, atuando como bridge entre operações e desenvolvimento</w:t>
       </w:r>
+      <w:r>
+        <w:rPr>
+          <w:rtl w:val="0"/>
+        </w:rPr>
+      </w:r>
     </w:p>
     <w:p>
       <w:pPr>
@@ -3246,6 +3371,11 @@
         </w:rPr>
         <w:t xml:space="preserve">Conduzi pilotos de engajamento de clientes, validando hipóteses com dados antes de rollout em larga escala</w:t>
       </w:r>
+      <w:r>
+        <w:rPr>
+          <w:rtl w:val="0"/>
+        </w:rPr>
+      </w:r>
     </w:p>
     <w:p>
       <w:pPr>
@@ -3681,6 +3811,11 @@
         </w:rPr>
         <w:t xml:space="preserve">Conduzi análises de dados de parceiros restaurantes para identificar gargalos operacionais e fricções na jornada digital</w:t>
       </w:r>
+      <w:r>
+        <w:rPr>
+          <w:rtl w:val="0"/>
+        </w:rPr>
+      </w:r>
     </w:p>
     <w:p>
       <w:pPr>
@@ -3724,6 +3859,11 @@
         </w:rPr>
         <w:t xml:space="preserve">Mapeei comportamentos de usuários através de análise de dados, gerando insights que aumentaram ativação em ~20% e retenção em ~12%</w:t>
       </w:r>
+      <w:r>
+        <w:rPr>
+          <w:rtl w:val="0"/>
+        </w:rPr>
+      </w:r>
     </w:p>
     <w:p>
       <w:pPr>
@@ -3767,6 +3907,11 @@
         </w:rPr>
         <w:t xml:space="preserve">Traduzi necessidades operacionais do campo em requisitos técnicos para a equipe de desenvolvimento, contribuindo para evolução do sistema logístico HUB</w:t>
       </w:r>
+      <w:r>
+        <w:rPr>
+          <w:rtl w:val="0"/>
+        </w:rPr>
+      </w:r>
     </w:p>
     <w:p>
       <w:pPr>
@@ -3810,6 +3955,11 @@
         </w:rPr>
         <w:t xml:space="preserve">Monitorei dashboards de performance para priorizar ações estratégicas, resultando em maior eficiência operacional</w:t>
       </w:r>
+      <w:r>
+        <w:rPr>
+          <w:rtl w:val="0"/>
+        </w:rPr>
+      </w:r>
     </w:p>
     <w:p>
       <w:pPr>
@@ -3853,6 +4003,11 @@
         </w:rPr>
         <w:t xml:space="preserve">Atuei como Product Owner em pilotos, validando soluções antes de implementação em larga escala</w:t>
       </w:r>
+      <w:r>
+        <w:rPr>
+          <w:rtl w:val="0"/>
+        </w:rPr>
+      </w:r>
     </w:p>
     <w:p>
       <w:pPr>
@@ -4288,6 +4443,11 @@
         </w:rPr>
         <w:t xml:space="preserve">Estruturei operação norte-americana baseada em análise de mercado e validação de requisitos funcionais</w:t>
       </w:r>
+      <w:r>
+        <w:rPr>
+          <w:rtl w:val="0"/>
+        </w:rPr>
+      </w:r>
     </w:p>
     <w:p>
       <w:pPr>
@@ -4331,6 +4491,11 @@
         </w:rPr>
         <w:t xml:space="preserve">Conduzi descoberta de usuários para definir product-market fit</w:t>
       </w:r>
+      <w:r>
+        <w:rPr>
+          <w:rtl w:val="0"/>
+        </w:rPr>
+      </w:r>
     </w:p>
     <w:p>
       <w:pPr>
@@ -4374,6 +4539,11 @@
         </w:rPr>
         <w:t xml:space="preserve">Defini métricas de sucesso e supervisionei implementação de processos operacionais escaláveis</w:t>
       </w:r>
+      <w:r>
+        <w:rPr>
+          <w:rtl w:val="0"/>
+        </w:rPr>
+      </w:r>
     </w:p>
     <w:p>
       <w:pPr>
@@ -4417,6 +4587,11 @@
         </w:rPr>
         <w:t xml:space="preserve">Atuei como primeiro Product Owner, liderando adaptação da proposta de valor ao mercado local</w:t>
       </w:r>
+      <w:r>
+        <w:rPr>
+          <w:rtl w:val="0"/>
+        </w:rPr>
+      </w:r>
     </w:p>
     <w:p>
       <w:pPr>
@@ -9804,6 +9979,11 @@
         </w:rPr>
         <w:t xml:space="preserve"> (em andamento) — Python, SQL, Bancos Relacionais, Pipelines</w:t>
       </w:r>
+      <w:r>
+        <w:rPr>
+          <w:rtl w:val="0"/>
+        </w:rPr>
+      </w:r>
     </w:p>
     <w:p>
       <w:pPr>
@@ -9866,6 +10046,11 @@
         </w:rPr>
         <w:t xml:space="preserve"> — IBM</w:t>
       </w:r>
+      <w:r>
+        <w:rPr>
+          <w:rtl w:val="0"/>
+        </w:rPr>
+      </w:r>
     </w:p>
     <w:p>
       <w:pPr>
@@ -9928,6 +10113,11 @@
         </w:rPr>
         <w:t xml:space="preserve"> — IBM</w:t>
       </w:r>
+      <w:r>
+        <w:rPr>
+          <w:rtl w:val="0"/>
+        </w:rPr>
+      </w:r>
     </w:p>
     <w:p>
       <w:pPr>
@@ -9990,6 +10180,11 @@
         </w:rPr>
         <w:t xml:space="preserve"> — IBM</w:t>
       </w:r>
+      <w:r>
+        <w:rPr>
+          <w:rtl w:val="0"/>
+        </w:rPr>
+      </w:r>
     </w:p>
     <w:p>
       <w:pPr>
@@ -10052,6 +10247,11 @@
         </w:rPr>
         <w:t xml:space="preserve"> — IBM</w:t>
       </w:r>
+      <w:r>
+        <w:rPr>
+          <w:rtl w:val="0"/>
+        </w:rPr>
+      </w:r>
     </w:p>
     <w:p>
       <w:pPr>
@@ -10114,6 +10314,11 @@
         </w:rPr>
         <w:t xml:space="preserve"> — Alura/Google</w:t>
       </w:r>
+      <w:r>
+        <w:rPr>
+          <w:rtl w:val="0"/>
+        </w:rPr>
+      </w:r>
     </w:p>
     <w:p>
       <w:pPr>
@@ -10176,6 +10381,11 @@
         </w:rPr>
         <w:t xml:space="preserve"> — Vanderbilt University</w:t>
       </w:r>
+      <w:r>
+        <w:rPr>
+          <w:rtl w:val="0"/>
+        </w:rPr>
+      </w:r>
     </w:p>
     <w:p>
       <w:pPr>
@@ -10238,6 +10448,11 @@
         </w:rPr>
         <w:t xml:space="preserve"> — PUC-PR</w:t>
       </w:r>
+      <w:r>
+        <w:rPr>
+          <w:rtl w:val="0"/>
+        </w:rPr>
+      </w:r>
     </w:p>
     <w:p>
       <w:pPr>
@@ -10470,6 +10685,11 @@
         </w:rPr>
         <w:t xml:space="preserve"> no GitHub no último ano</w:t>
       </w:r>
+      <w:r>
+        <w:rPr>
+          <w:rtl w:val="0"/>
+        </w:rPr>
+      </w:r>
     </w:p>
     <w:p>
       <w:pPr>
@@ -10532,6 +10752,11 @@
         </w:rPr>
         <w:t xml:space="preserve"> com projetos de Data Engineering</w:t>
       </w:r>
+      <w:r>
+        <w:rPr>
+          <w:rtl w:val="0"/>
+        </w:rPr>
+      </w:r>
     </w:p>
     <w:p>
       <w:pPr>
@@ -10594,6 +10819,11 @@
         </w:rPr>
         <w:t xml:space="preserve"> Python, SQL, Automação, IA/LLMs, Engenharia de Dados</w:t>
       </w:r>
+      <w:r>
+        <w:rPr>
+          <w:rtl w:val="0"/>
+        </w:rPr>
+      </w:r>
     </w:p>
     <w:p>
       <w:pPr>
@@ -10656,6 +10886,11 @@
         </w:rPr>
         <w:t xml:space="preserve"> 73% commits, 25% issues, 2% pull requests</w:t>
       </w:r>
+      <w:r>
+        <w:rPr>
+          <w:rtl w:val="0"/>
+        </w:rPr>
+      </w:r>
     </w:p>
     <w:p>
       <w:pPr>
@@ -10888,6 +11123,11 @@
         </w:rPr>
         <w:t xml:space="preserve"> 15 anos em liderança e operações. Entendo o "por quê" dos dados, não só o "como".</w:t>
       </w:r>
+      <w:r>
+        <w:rPr>
+          <w:rtl w:val="0"/>
+        </w:rPr>
+      </w:r>
     </w:p>
     <w:p>
       <w:pPr>
@@ -10950,6 +11190,11 @@
         </w:rPr>
         <w:t xml:space="preserve"> Expertise em n8n, Zapier, Make — ferramentas low-code cada vez mais valorizadas.</w:t>
       </w:r>
+      <w:r>
+        <w:rPr>
+          <w:rtl w:val="0"/>
+        </w:rPr>
+      </w:r>
     </w:p>
     <w:p>
       <w:pPr>
@@ -11012,6 +11257,11 @@
         </w:rPr>
         <w:t xml:space="preserve"> Projetos práticos com OpenAI, Prompt Engineering, Agentes Inteligentes.</w:t>
       </w:r>
+      <w:r>
+        <w:rPr>
+          <w:rtl w:val="0"/>
+        </w:rPr>
+      </w:r>
     </w:p>
     <w:p>
       <w:pPr>
@@ -11074,6 +11324,11 @@
         </w:rPr>
         <w:t xml:space="preserve"> 9 projetos no GitHub com documentação e impacto de negócio claro.</w:t>
       </w:r>
+      <w:r>
+        <w:rPr>
+          <w:rtl w:val="0"/>
+        </w:rPr>
+      </w:r>
     </w:p>
     <w:p>
       <w:pPr>
@@ -11136,6 +11391,11 @@
         </w:rPr>
         <w:t xml:space="preserve"> Capacidade de traduzir conceitos técnicos para stakeholders não-técnicos.</w:t>
       </w:r>
+      <w:r>
+        <w:rPr>
+          <w:rtl w:val="0"/>
+        </w:rPr>
+      </w:r>
     </w:p>
     <w:p>
       <w:pPr>
@@ -11368,6 +11628,11 @@
         </w:rPr>
         <w:t xml:space="preserve"> 100% Remoto</w:t>
       </w:r>
+      <w:r>
+        <w:rPr>
+          <w:rtl w:val="0"/>
+        </w:rPr>
+      </w:r>
     </w:p>
     <w:p>
       <w:pPr>
@@ -11430,6 +11695,11 @@
         </w:rPr>
         <w:t xml:space="preserve"> Francisco Beltrão, PR, Brasil</w:t>
       </w:r>
+      <w:r>
+        <w:rPr>
+          <w:rtl w:val="0"/>
+        </w:rPr>
+      </w:r>
     </w:p>
     <w:p>
       <w:pPr>
@@ -11492,6 +11762,11 @@
         </w:rPr>
         <w:t xml:space="preserve"> Flexível (UTC-3)</w:t>
       </w:r>
+      <w:r>
+        <w:rPr>
+          <w:rtl w:val="0"/>
+        </w:rPr>
+      </w:r>
     </w:p>
     <w:p>
       <w:pPr>
@@ -11553,6 +11828,11 @@
           <w:rtl w:val="0"/>
         </w:rPr>
         <w:t xml:space="preserve"> Imediata</w:t>
+      </w:r>
+      <w:r>
+        <w:rPr>
+          <w:rtl w:val="0"/>
+        </w:rPr>
       </w:r>
     </w:p>
     <w:p>
@@ -11965,22 +12245,13 @@
       <w:hyperlink r:id="rId9">
         <w:r>
           <w:rPr>
-            <w:rFonts w:ascii="Times New Roman" w:cs="Times New Roman" w:eastAsia="Times New Roman" w:hAnsi="Times New Roman"/>
-            <w:b w:val="0"/>
-            <w:bCs w:val="0"/>
-            <w:i w:val="0"/>
-            <w:iCs w:val="0"/>
-            <w:smallCaps w:val="0"/>
-            <w:strike w:val="0"/>
-            <w:color w:val="0563c1"/>
-            <w:sz w:val="24"/>
-            <w:szCs w:val="24"/>
+            <w:color w:val="1155cc"/>
+            <w:sz w:val="26"/>
+            <w:szCs w:val="26"/>
             <w:u w:val="single"/>
-            <w:shd w:fill="auto" w:val="clear"/>
-            <w:vertAlign w:val="baseline"/>
             <w:rtl w:val="0"/>
           </w:rPr>
-          <w:t xml:space="preserve">https://www.notion.so/Portf-lio-Diego-Santos-2d759002adff8006ad4af089a4c04c29</w:t>
+          <w:t xml:space="preserve">https://diegosantos-ai.github.io/diego-santos-portfolio/</w:t>
         </w:r>
       </w:hyperlink>
       <w:r>

</xml_diff>